<commit_message>
Actualizar contenido, cronogramas y tutor de Keidy
</commit_message>
<xml_diff>
--- a/keidy/cronogramas/Cronograma_Procura_Semana10_IUTECP.docx
+++ b/keidy/cronogramas/Cronograma_Procura_Semana10_IUTECP.docx
@@ -113,7 +113,7 @@
           <w:rFonts w:ascii="Times New Roman" w:hAnsi="Times New Roman"/>
           <w:sz w:val="24"/>
         </w:rPr>
-        <w:t>Del 03 al 07 de agosto de 2026</w:t>
+        <w:t>Del 10 al 14 de agosto de 2026</w:t>
       </w:r>
     </w:p>
     <w:p>
@@ -134,6 +134,26 @@
           <w:sz w:val="24"/>
         </w:rPr>
         <w:t>Keidy Guzmán |  C.I.: 28.706.352</w:t>
+      </w:r>
+    </w:p>
+    <w:p>
+      <w:pPr>
+        <w:spacing w:line="276" w:lineRule="auto" w:after="40"/>
+      </w:pPr>
+      <w:r>
+        <w:rPr>
+          <w:rFonts w:ascii="Times New Roman" w:hAnsi="Times New Roman"/>
+          <w:b/>
+          <w:sz w:val="24"/>
+        </w:rPr>
+        <w:t xml:space="preserve">TUTOR INDUSTRIAL: </w:t>
+      </w:r>
+      <w:r>
+        <w:rPr>
+          <w:rFonts w:ascii="Times New Roman" w:hAnsi="Times New Roman"/>
+          <w:sz w:val="24"/>
+        </w:rPr>
+        <w:t>Martina Rondón | C.I.: 12.208.768</w:t>
       </w:r>
     </w:p>
     <w:p/>
@@ -822,25 +842,8 @@
         <w:tc>
           <w:tcPr>
             <w:tcW w:type="dxa" w:w="4133"/>
-            <w:vAlign w:val="center"/>
           </w:tcPr>
-          <w:p>
-            <w:pPr>
-              <w:spacing w:line="240" w:lineRule="auto" w:before="80" w:after="80"/>
-              <w:jc w:val="center"/>
-            </w:pPr>
-            <w:r/>
-            <w:r>
-              <w:rPr>
-                <w:rFonts w:ascii="Times New Roman" w:hAnsi="Times New Roman"/>
-                <w:b w:val="0"/>
-                <w:sz w:val="18"/>
-              </w:rPr>
-              <w:t>Firma del Pasante:</w:t>
-              <w:br/>
-              <w:t>Keidy Guzmán |  C.I.: 28.706.352</w:t>
-            </w:r>
-          </w:p>
+          <w:p/>
         </w:tc>
         <w:tc>
           <w:tcPr>

</xml_diff>

<commit_message>
Activar firmas y limpiar bloque de firmas en cronograma.py de Keidy
</commit_message>
<xml_diff>
--- a/keidy/cronogramas/Cronograma_Procura_Semana10_IUTECP.docx
+++ b/keidy/cronogramas/Cronograma_Procura_Semana10_IUTECP.docx
@@ -834,22 +834,71 @@
         <w:tc>
           <w:tcPr>
             <w:tcW w:type="dxa" w:w="4139"/>
+            <w:vAlign w:val="center"/>
           </w:tcPr>
-          <w:p/>
+          <w:p>
+            <w:pPr>
+              <w:spacing w:line="240" w:lineRule="auto" w:before="80" w:after="80"/>
+              <w:jc w:val="center"/>
+            </w:pPr>
+            <w:r/>
+            <w:r>
+              <w:rPr>
+                <w:rFonts w:ascii="Times New Roman" w:hAnsi="Times New Roman"/>
+                <w:b w:val="0"/>
+                <w:sz w:val="24"/>
+              </w:rPr>
+              <w:t>_________________________</w:t>
+            </w:r>
+          </w:p>
         </w:tc>
       </w:tr>
       <w:tr>
         <w:tc>
           <w:tcPr>
             <w:tcW w:type="dxa" w:w="4133"/>
+            <w:vAlign w:val="center"/>
           </w:tcPr>
-          <w:p/>
+          <w:p>
+            <w:pPr>
+              <w:spacing w:line="240" w:lineRule="auto" w:before="80" w:after="80"/>
+              <w:jc w:val="center"/>
+            </w:pPr>
+            <w:r/>
+            <w:r>
+              <w:rPr>
+                <w:rFonts w:ascii="Times New Roman" w:hAnsi="Times New Roman"/>
+                <w:b w:val="0"/>
+                <w:sz w:val="18"/>
+              </w:rPr>
+              <w:t>Firma del Pasante:</w:t>
+              <w:br/>
+              <w:t>Keidy Guzmán |  C.I.: 28.706.352</w:t>
+            </w:r>
+          </w:p>
         </w:tc>
         <w:tc>
           <w:tcPr>
             <w:tcW w:type="dxa" w:w="4139"/>
+            <w:vAlign w:val="center"/>
           </w:tcPr>
-          <w:p/>
+          <w:p>
+            <w:pPr>
+              <w:spacing w:line="240" w:lineRule="auto" w:before="80" w:after="80"/>
+              <w:jc w:val="center"/>
+            </w:pPr>
+            <w:r/>
+            <w:r>
+              <w:rPr>
+                <w:rFonts w:ascii="Times New Roman" w:hAnsi="Times New Roman"/>
+                <w:b w:val="0"/>
+                <w:sz w:val="18"/>
+              </w:rPr>
+              <w:t>Firma del Tutor Industrial:</w:t>
+              <w:br/>
+              <w:t>Martina Rondón | C.I.: 12.208.768</w:t>
+            </w:r>
+          </w:p>
         </w:tc>
       </w:tr>
     </w:tbl>

</xml_diff>

<commit_message>
Regenerar y actualizar cronogramas semanales compilados de Keidy
</commit_message>
<xml_diff>
--- a/keidy/cronogramas/Cronograma_Procura_Semana10_IUTECP.docx
+++ b/keidy/cronogramas/Cronograma_Procura_Semana10_IUTECP.docx
@@ -903,6 +903,20 @@
       </w:tr>
     </w:tbl>
     <w:p/>
+    <w:p>
+      <w:pPr>
+        <w:spacing w:before="240"/>
+        <w:jc w:val="center"/>
+      </w:pPr>
+      <w:r>
+        <w:rPr>
+          <w:rFonts w:ascii="Times New Roman" w:hAnsi="Times New Roman"/>
+          <w:b/>
+          <w:sz w:val="20"/>
+        </w:rPr>
+        <w:t>SELLO DE LA EMPRESA</w:t>
+      </w:r>
+    </w:p>
     <w:sectPr>
       <w:pgSz w:w="12240" w:h="15840"/>
       <w:pgMar w:top="1701" w:right="1701" w:bottom="1701" w:left="2268" w:header="720" w:footer="720" w:gutter="0"/>

</xml_diff>

<commit_message>
keidy: quitar observaciones_tutor inyectadas, dejar lineas como juliano
</commit_message>
<xml_diff>
--- a/keidy/cronogramas/Cronograma_Procura_Semana10_IUTECP.docx
+++ b/keidy/cronogramas/Cronograma_Procura_Semana10_IUTECP.docx
@@ -778,16 +778,63 @@
     </w:p>
     <w:p>
       <w:pPr>
-        <w:spacing w:line="360" w:lineRule="auto" w:after="0"/>
-        <w:jc w:val="both"/>
+        <w:spacing w:line="360" w:lineRule="auto"/>
       </w:pPr>
       <w:r>
         <w:rPr>
           <w:rFonts w:ascii="Times New Roman" w:hAnsi="Times New Roman"/>
-          <w:b w:val="0"/>
-          <w:sz w:val="24"/>
+          <w:i/>
+          <w:sz w:val="22"/>
         </w:rPr>
-        <w:t>La pasante Keidy Guzmán culminó exitosamente su proyecto. La propuesta de ordenamiento y formatos de compras constituye un gran aporte para el control interno. Proyecto aprobado.</w:t>
+        <w:t>(Espacio reservado para la evaluación cualitativa del tutor sobre control de procesos, puntualidad, manejo de solicitudes y cumplimiento de directrices contables)</w:t>
+      </w:r>
+    </w:p>
+    <w:p>
+      <w:pPr>
+        <w:spacing w:before="160" w:after="0"/>
+      </w:pPr>
+      <w:r>
+        <w:rPr>
+          <w:rFonts w:ascii="Times New Roman" w:hAnsi="Times New Roman"/>
+          <w:b/>
+        </w:rPr>
+        <w:t>___________________________________________________________________________</w:t>
+      </w:r>
+    </w:p>
+    <w:p>
+      <w:pPr>
+        <w:spacing w:before="160" w:after="0"/>
+      </w:pPr>
+      <w:r>
+        <w:rPr>
+          <w:rFonts w:ascii="Times New Roman" w:hAnsi="Times New Roman"/>
+          <w:b/>
+        </w:rPr>
+        <w:t>___________________________________________________________________________</w:t>
+      </w:r>
+    </w:p>
+    <w:p>
+      <w:pPr>
+        <w:spacing w:before="160" w:after="0"/>
+      </w:pPr>
+      <w:r>
+        <w:rPr>
+          <w:rFonts w:ascii="Times New Roman" w:hAnsi="Times New Roman"/>
+          <w:b/>
+        </w:rPr>
+        <w:t>___________________________________________________________________________</w:t>
+      </w:r>
+    </w:p>
+    <w:p>
+      <w:pPr>
+        <w:spacing w:before="160" w:after="0"/>
+      </w:pPr>
+      <w:r>
+        <w:rPr>
+          <w:rFonts w:ascii="Times New Roman" w:hAnsi="Times New Roman"/>
+          <w:b/>
+        </w:rPr>
+        <w:t>___________________________________________________________________________</w:t>
       </w:r>
     </w:p>
     <w:p/>

</xml_diff>

<commit_message>
Keidy: cronogramas semanales reescritos (balance operativa/investigacion, hilo simplificacion)
</commit_message>
<xml_diff>
--- a/keidy/cronogramas/Cronograma_Procura_Semana10_IUTECP.docx
+++ b/keidy/cronogramas/Cronograma_Procura_Semana10_IUTECP.docx
@@ -181,7 +181,7 @@
           <w:b w:val="0"/>
           <w:sz w:val="24"/>
         </w:rPr>
-        <w:t>Consolidar el informe final del proyecto de pasantías y presentarlo ante la gerencia de la empresa.</w:t>
+        <w:t>Presentar formalmente la propuesta de simplificación ante la gerencia y consolidar el informe académico de pasantías.</w:t>
       </w:r>
     </w:p>
     <w:p/>
@@ -342,7 +342,7 @@
                 <w:b w:val="0"/>
                 <w:sz w:val="20"/>
               </w:rPr>
-              <w:t>Integración del informe</w:t>
+              <w:t>Presentación ante la gerencia</w:t>
             </w:r>
           </w:p>
         </w:tc>
@@ -363,7 +363,7 @@
                 <w:b w:val="0"/>
                 <w:sz w:val="20"/>
               </w:rPr>
-              <w:t>Compilar los capítulos, diagnósticos, diagramas y anexos de formatos en el documento definitivo.</w:t>
+              <w:t>Exponer formalmente la propuesta de simplificación administrativa ante la gerencia del departamento.</w:t>
             </w:r>
           </w:p>
         </w:tc>
@@ -384,7 +384,7 @@
                 <w:b w:val="0"/>
                 <w:sz w:val="20"/>
               </w:rPr>
-              <w:t>Word, Normas IUTECP</w:t>
+              <w:t>Documento final, oficina de gerencia</w:t>
             </w:r>
           </w:p>
         </w:tc>
@@ -428,7 +428,7 @@
                 <w:b w:val="0"/>
                 <w:sz w:val="20"/>
               </w:rPr>
-              <w:t>Revisión de estilo</w:t>
+              <w:t>Firma de la carta de aprobación</w:t>
             </w:r>
           </w:p>
         </w:tc>
@@ -449,7 +449,7 @@
                 <w:b w:val="0"/>
                 <w:sz w:val="20"/>
               </w:rPr>
-              <w:t>Verificar la ortografía, referencias, sangrías y márgenes del informe final.</w:t>
+              <w:t>Gestionar la firma de la carta de aprobación del tutor industrial para el expediente académico.</w:t>
             </w:r>
           </w:p>
         </w:tc>
@@ -470,7 +470,7 @@
                 <w:b w:val="0"/>
                 <w:sz w:val="20"/>
               </w:rPr>
-              <w:t>PC de oficina</w:t>
+              <w:t>Formato institucional, bolígrafo</w:t>
             </w:r>
           </w:p>
         </w:tc>
@@ -514,7 +514,7 @@
                 <w:b w:val="0"/>
                 <w:sz w:val="20"/>
               </w:rPr>
-              <w:t>Firma de avales</w:t>
+              <w:t>Consolidación del informe académico</w:t>
             </w:r>
           </w:p>
         </w:tc>
@@ -535,7 +535,7 @@
                 <w:b w:val="0"/>
                 <w:sz w:val="20"/>
               </w:rPr>
-              <w:t>Coordinar con el tutor industrial la firma y sellado de las planillas de evaluación y culminación.</w:t>
+              <w:t>Integrar todos los capítulos, anexos y formatos en el documento académico definitivo.</w:t>
             </w:r>
           </w:p>
         </w:tc>
@@ -556,7 +556,7 @@
                 <w:b w:val="0"/>
                 <w:sz w:val="20"/>
               </w:rPr>
-              <w:t>Documentos impresos, bolígrafos</w:t>
+              <w:t>PC de oficina, procesador de textos</w:t>
             </w:r>
           </w:p>
         </w:tc>
@@ -600,7 +600,7 @@
                 <w:b w:val="0"/>
                 <w:sz w:val="20"/>
               </w:rPr>
-              <w:t>Resguardo de archivos</w:t>
+              <w:t>Revisión final del informe</w:t>
             </w:r>
           </w:p>
         </w:tc>
@@ -621,7 +621,7 @@
                 <w:b w:val="0"/>
                 <w:sz w:val="20"/>
               </w:rPr>
-              <w:t>Guardar copias digitales de los informes y del formato de Excel en un dispositivo de almacenamiento.</w:t>
+              <w:t>Verificar ortografía, referencias bibliográficas, márgenes y normas de presentación del informe.</w:t>
             </w:r>
           </w:p>
         </w:tc>
@@ -642,7 +642,7 @@
                 <w:b w:val="0"/>
                 <w:sz w:val="20"/>
               </w:rPr>
-              <w:t>Pendrive, carpetas compartidas</w:t>
+              <w:t>Normativa IUTECP, PC de oficina</w:t>
             </w:r>
           </w:p>
         </w:tc>
@@ -686,7 +686,7 @@
                 <w:b w:val="0"/>
                 <w:sz w:val="20"/>
               </w:rPr>
-              <w:t>Exposición de cierre</w:t>
+              <w:t>Preparación para entrega institucional</w:t>
             </w:r>
           </w:p>
         </w:tc>
@@ -707,7 +707,7 @@
                 <w:b w:val="0"/>
                 <w:sz w:val="20"/>
               </w:rPr>
-              <w:t>Explicar a la gerencia de la empresa cómo quedan instaurados los nuevos formatos y el protocolo del departamento.</w:t>
+              <w:t>Organizar los archivos digitales e impresos del informe final para su consignación ante el IUTECP.</w:t>
             </w:r>
           </w:p>
         </w:tc>
@@ -728,7 +728,7 @@
                 <w:b w:val="0"/>
                 <w:sz w:val="20"/>
               </w:rPr>
-              <w:t>Formatos finales, oficina de gerencia</w:t>
+              <w:t>Pendrive, impresora, carpeta de entrega</w:t>
             </w:r>
           </w:p>
         </w:tc>
@@ -759,7 +759,7 @@
           <w:b w:val="0"/>
           <w:sz w:val="24"/>
         </w:rPr>
-        <w:t>Informe final de pasantías con anexos listos para consignar ante el IUTECP.</w:t>
+        <w:t>Carta de aprobación del tutor industrial firmada e informe académico final listo para entrega institucional.</w:t>
       </w:r>
     </w:p>
     <w:p/>

</xml_diff>

<commit_message>
Keidy: observaciones del tutor corregidas en las 10 semanas
</commit_message>
<xml_diff>
--- a/keidy/cronogramas/Cronograma_Procura_Semana10_IUTECP.docx
+++ b/keidy/cronogramas/Cronograma_Procura_Semana10_IUTECP.docx
@@ -778,63 +778,16 @@
     </w:p>
     <w:p>
       <w:pPr>
-        <w:spacing w:line="360" w:lineRule="auto"/>
+        <w:spacing w:line="360" w:lineRule="auto" w:after="0"/>
+        <w:jc w:val="both"/>
       </w:pPr>
       <w:r>
         <w:rPr>
           <w:rFonts w:ascii="Times New Roman" w:hAnsi="Times New Roman"/>
-          <w:i/>
-          <w:sz w:val="22"/>
+          <w:b w:val="0"/>
+          <w:sz w:val="24"/>
         </w:rPr>
-        <w:t>(Espacio reservado para la evaluación cualitativa del tutor sobre control de procesos, puntualidad, manejo de solicitudes y cumplimiento de directrices contables)</w:t>
-      </w:r>
-    </w:p>
-    <w:p>
-      <w:pPr>
-        <w:spacing w:before="160" w:after="0"/>
-      </w:pPr>
-      <w:r>
-        <w:rPr>
-          <w:rFonts w:ascii="Times New Roman" w:hAnsi="Times New Roman"/>
-          <w:b/>
-        </w:rPr>
-        <w:t>___________________________________________________________________________</w:t>
-      </w:r>
-    </w:p>
-    <w:p>
-      <w:pPr>
-        <w:spacing w:before="160" w:after="0"/>
-      </w:pPr>
-      <w:r>
-        <w:rPr>
-          <w:rFonts w:ascii="Times New Roman" w:hAnsi="Times New Roman"/>
-          <w:b/>
-        </w:rPr>
-        <w:t>___________________________________________________________________________</w:t>
-      </w:r>
-    </w:p>
-    <w:p>
-      <w:pPr>
-        <w:spacing w:before="160" w:after="0"/>
-      </w:pPr>
-      <w:r>
-        <w:rPr>
-          <w:rFonts w:ascii="Times New Roman" w:hAnsi="Times New Roman"/>
-          <w:b/>
-        </w:rPr>
-        <w:t>___________________________________________________________________________</w:t>
-      </w:r>
-    </w:p>
-    <w:p>
-      <w:pPr>
-        <w:spacing w:before="160" w:after="0"/>
-      </w:pPr>
-      <w:r>
-        <w:rPr>
-          <w:rFonts w:ascii="Times New Roman" w:hAnsi="Times New Roman"/>
-          <w:b/>
-        </w:rPr>
-        <w:t>___________________________________________________________________________</w:t>
+        <w:t>La pasante culminó satisfactoriamente su período de pasantías. La presentación ante la gerencia fue clara y el informe final cumple con los requisitos institucionales.</w:t>
       </w:r>
     </w:p>
     <w:p/>

</xml_diff>

<commit_message>
Recompilar cronogramas de Keidy
</commit_message>
<xml_diff>
--- a/keidy/cronogramas/Cronograma_Procura_Semana10_IUTECP.docx
+++ b/keidy/cronogramas/Cronograma_Procura_Semana10_IUTECP.docx
@@ -707,7 +707,7 @@
                 <w:b w:val="0"/>
                 <w:sz w:val="20"/>
               </w:rPr>
-              <w:t>Organizar la versión digital e impresa para su consignación institucional.</w:t>
+              <w:t>Organizar la versión digital para su consignación institucional.</w:t>
             </w:r>
           </w:p>
         </w:tc>
@@ -728,7 +728,7 @@
                 <w:b w:val="0"/>
                 <w:sz w:val="20"/>
               </w:rPr>
-              <w:t>Pendrive, impresora, carpeta</w:t>
+              <w:t>Pendrive, carpeta</w:t>
             </w:r>
           </w:p>
         </w:tc>
@@ -778,63 +778,16 @@
     </w:p>
     <w:p>
       <w:pPr>
-        <w:spacing w:line="360" w:lineRule="auto"/>
+        <w:spacing w:line="360" w:lineRule="auto" w:after="0"/>
+        <w:jc w:val="both"/>
       </w:pPr>
       <w:r>
         <w:rPr>
           <w:rFonts w:ascii="Times New Roman" w:hAnsi="Times New Roman"/>
-          <w:i/>
-          <w:sz w:val="22"/>
+          <w:b w:val="0"/>
+          <w:sz w:val="24"/>
         </w:rPr>
-        <w:t>(Espacio reservado para la evaluación cualitativa del tutor sobre control de procesos, puntualidad, manejo de solicitudes y cumplimiento de directrices contables)</w:t>
-      </w:r>
-    </w:p>
-    <w:p>
-      <w:pPr>
-        <w:spacing w:before="160" w:after="0"/>
-      </w:pPr>
-      <w:r>
-        <w:rPr>
-          <w:rFonts w:ascii="Times New Roman" w:hAnsi="Times New Roman"/>
-          <w:b/>
-        </w:rPr>
-        <w:t>___________________________________________________________________________</w:t>
-      </w:r>
-    </w:p>
-    <w:p>
-      <w:pPr>
-        <w:spacing w:before="160" w:after="0"/>
-      </w:pPr>
-      <w:r>
-        <w:rPr>
-          <w:rFonts w:ascii="Times New Roman" w:hAnsi="Times New Roman"/>
-          <w:b/>
-        </w:rPr>
-        <w:t>___________________________________________________________________________</w:t>
-      </w:r>
-    </w:p>
-    <w:p>
-      <w:pPr>
-        <w:spacing w:before="160" w:after="0"/>
-      </w:pPr>
-      <w:r>
-        <w:rPr>
-          <w:rFonts w:ascii="Times New Roman" w:hAnsi="Times New Roman"/>
-          <w:b/>
-        </w:rPr>
-        <w:t>___________________________________________________________________________</w:t>
-      </w:r>
-    </w:p>
-    <w:p>
-      <w:pPr>
-        <w:spacing w:before="160" w:after="0"/>
-      </w:pPr>
-      <w:r>
-        <w:rPr>
-          <w:rFonts w:ascii="Times New Roman" w:hAnsi="Times New Roman"/>
-          <w:b/>
-        </w:rPr>
-        <w:t>___________________________________________________________________________</w:t>
+        <w:t>La pasante culminó satisfactoriamente el período de pasantías, demostrando responsabilidad, puntualidad, disposición para recibir sugerencias y cumplimiento de las actividades programadas. Se evidenció una evolución favorable en el manejo de los procesos administrativos y de procura.</w:t>
       </w:r>
     </w:p>
     <w:p/>

</xml_diff>